<commit_message>
docs: standardize nomenclature from Lab 2 to Lab 1b across reports, tests and README
</commit_message>
<xml_diff>
--- a/Lab_Homework_25560063_DoAnhTuan.docx
+++ b/Lab_Homework_25560063_DoAnhTuan.docx
@@ -17,7 +17,7 @@
           <w:i w:val="0"/>
           <w:iCs w:val="0"/>
         </w:rPr>
-        <w:t>Lab 1 and Lab 2 Homework Practical Report</w:t>
+        <w:t>Lab 1 and Lab 1b Homework Practical Report</w:t>
       </w:r>
     </w:p>
     <w:p>
@@ -1276,7 +1276,7 @@
           <w:i w:val="0"/>
           <w:iCs w:val="0"/>
         </w:rPr>
-        <w:t>Lab 2 - Homework 1: SQL Order Transaction Integrity</w:t>
+        <w:t>Lab 1b - Homework 1: SQL Order Transaction Integrity</w:t>
       </w:r>
     </w:p>
     <w:p>
@@ -1399,7 +1399,7 @@
           <w:i w:val="0"/>
           <w:iCs w:val="0"/>
         </w:rPr>
-        <w:t>Lab 2 - Homework 1: SQL Order Transaction Integrity</w:t>
+        <w:t>Lab 1b - Homework 1: SQL Order Transaction Integrity</w:t>
       </w:r>
     </w:p>
     <w:p>
@@ -1586,7 +1586,7 @@
           <w:i w:val="0"/>
           <w:iCs w:val="0"/>
         </w:rPr>
-        <w:t>Lab 2 - Homework 1: SQL Order Transaction Integrity</w:t>
+        <w:t>Lab 1b - Homework 1: SQL Order Transaction Integrity</w:t>
       </w:r>
     </w:p>
     <w:p>
@@ -1709,7 +1709,7 @@
           <w:i w:val="0"/>
           <w:iCs w:val="0"/>
         </w:rPr>
-        <w:t>Lab 2 - Homework 2: Mongoose Many-to-Many Course Registration</w:t>
+        <w:t>Lab 1b - Homework 2: Mongoose Many-to-Many Course Registration</w:t>
       </w:r>
     </w:p>
     <w:p>
@@ -1832,7 +1832,7 @@
           <w:i w:val="0"/>
           <w:iCs w:val="0"/>
         </w:rPr>
-        <w:t>Lab 2 - Homework 2: Mongoose Many-to-Many Course Registration</w:t>
+        <w:t>Lab 1b - Homework 2: Mongoose Many-to-Many Course Registration</w:t>
       </w:r>
     </w:p>
     <w:p>
@@ -2019,7 +2019,7 @@
           <w:i w:val="0"/>
           <w:iCs w:val="0"/>
         </w:rPr>
-        <w:t>Lab 2 - Homework 2: Mongoose Many-to-Many Course Registration</w:t>
+        <w:t>Lab 1b - Homework 2: Mongoose Many-to-Many Course Registration</w:t>
       </w:r>
     </w:p>
     <w:p>
@@ -2142,7 +2142,7 @@
           <w:i w:val="0"/>
           <w:iCs w:val="0"/>
         </w:rPr>
-        <w:t>Lab 2 - Homework 3: Invoices JSON Validation &amp; Sync into MongoDB</w:t>
+        <w:t>Lab 1b - Homework 3: Invoices JSON Validation &amp; Sync into MongoDB</w:t>
       </w:r>
     </w:p>
     <w:p>
@@ -2265,7 +2265,7 @@
           <w:i w:val="0"/>
           <w:iCs w:val="0"/>
         </w:rPr>
-        <w:t>Lab 2 - Homework 3: Invoices JSON Validation &amp; Sync into MongoDB</w:t>
+        <w:t>Lab 1b - Homework 3: Invoices JSON Validation &amp; Sync into MongoDB</w:t>
       </w:r>
     </w:p>
     <w:p>
@@ -2452,7 +2452,7 @@
           <w:i w:val="0"/>
           <w:iCs w:val="0"/>
         </w:rPr>
-        <w:t>Lab 2 - Homework 3: Invoices JSON Validation &amp; Sync into MongoDB</w:t>
+        <w:t>Lab 1b - Homework 3: Invoices JSON Validation &amp; Sync into MongoDB</w:t>
       </w:r>
     </w:p>
     <w:p>

</xml_diff>